<commit_message>
Fixed the formatting issue
</commit_message>
<xml_diff>
--- a/samples/Appointment Letter and Employment Agreement - Bangalore.docx
+++ b/samples/Appointment Letter and Employment Agreement - Bangalore.docx
@@ -122,102 +122,10 @@
     </w:p>
     <w:p>
       <w:pPr>
-        <w:spacing w:before="90"/>
-        <w:ind w:left="116" w:right="7407" w:firstLine="593"/>
-        <w:jc w:val="both"/>
-        <w:rPr>
-          <w:spacing w:val="1"/>
-          <w:sz w:val="24"/>
-          <w:szCs w:val="24"/>
-        </w:rPr>
-      </w:pPr>
-      <w:r>
-        <w:rPr>
-          <w:b/>
-          <w:bCs/>
-          <w:sz w:val="24"/>
-          <w:szCs w:val="24"/>
-        </w:rPr>
-        <w:t>Name:</w:t>
-      </w:r>
-      <w:r>
-        <w:rPr>
-          <w:b/>
-          <w:bCs/>
-          <w:spacing w:val="75"/>
-          <w:sz w:val="24"/>
-          <w:szCs w:val="24"/>
-        </w:rPr>
-        <w:t xml:space="preserve"> </w:t>
-      </w:r>
-      <w:r>
-        <w:rPr>
-          <w:b/>
-          <w:bCs/>
-          <w:sz w:val="24"/>
-          <w:szCs w:val="24"/>
-        </w:rPr>
-        <w:t>{Name}</w:t>
-      </w:r>
-    </w:p>
-    <w:p>
-      <w:pPr>
-        <w:spacing w:before="90"/>
-        <w:ind w:left="709" w:right="6370"/>
-        <w:jc w:val="both"/>
-        <w:rPr>
-          <w:b/>
-          <w:bCs/>
-          <w:sz w:val="24"/>
-          <w:szCs w:val="24"/>
-          <w:highlight w:val="yellow"/>
-        </w:rPr>
-      </w:pPr>
-      <w:r>
-        <w:rPr>
-          <w:b/>
-          <w:bCs/>
-          <w:sz w:val="24"/>
-          <w:szCs w:val="24"/>
-        </w:rPr>
-        <w:t>Email:</w:t>
-      </w:r>
-      <w:r>
-        <w:rPr>
-          <w:b/>
-          <w:bCs/>
-          <w:sz w:val="24"/>
-          <w:szCs w:val="24"/>
-        </w:rPr>
-        <w:t xml:space="preserve"> </w:t>
-      </w:r>
-      <w:r>
-        <w:rPr>
-          <w:sz w:val="24"/>
-          <w:szCs w:val="24"/>
-        </w:rPr>
-        <w:t>{Email}</w:t>
-      </w:r>
-    </w:p>
-    <w:p>
-      <w:pPr>
-        <w:spacing w:before="90"/>
-        <w:ind w:left="709" w:right="6370"/>
-        <w:jc w:val="both"/>
-        <w:rPr>
-          <w:sz w:val="24"/>
-          <w:szCs w:val="24"/>
-        </w:rPr>
-      </w:pPr>
-    </w:p>
-    <w:p>
-      <w:pPr>
         <w:pStyle w:val="NoSpacing"/>
         <w:ind w:firstLine="709"/>
         <w:rPr>
           <w:rFonts w:ascii="Times New Roman" w:eastAsia="Times New Roman" w:hAnsi="Times New Roman" w:cs="Times New Roman"/>
-          <w:b/>
-          <w:bCs/>
           <w:sz w:val="24"/>
           <w:szCs w:val="24"/>
         </w:rPr>
@@ -230,23 +138,27 @@
           <w:sz w:val="24"/>
           <w:szCs w:val="24"/>
         </w:rPr>
-        <w:t>{Trainee Address</w:t>
+        <w:t xml:space="preserve">Name: </w:t>
       </w:r>
       <w:r>
         <w:rPr>
           <w:rFonts w:ascii="Times New Roman" w:eastAsia="Times New Roman" w:hAnsi="Times New Roman" w:cs="Times New Roman"/>
-          <w:b/>
-          <w:bCs/>
-          <w:sz w:val="24"/>
-          <w:szCs w:val="24"/>
-        </w:rPr>
-        <w:t xml:space="preserve"> line1</w:t>
+          <w:sz w:val="24"/>
+          <w:szCs w:val="24"/>
+        </w:rPr>
+        <w:t>{</w:t>
       </w:r>
       <w:r>
         <w:rPr>
           <w:rFonts w:ascii="Times New Roman" w:eastAsia="Times New Roman" w:hAnsi="Times New Roman" w:cs="Times New Roman"/>
-          <w:b/>
-          <w:bCs/>
+          <w:sz w:val="24"/>
+          <w:szCs w:val="24"/>
+        </w:rPr>
+        <w:t>Name</w:t>
+      </w:r>
+      <w:r>
+        <w:rPr>
+          <w:rFonts w:ascii="Times New Roman" w:eastAsia="Times New Roman" w:hAnsi="Times New Roman" w:cs="Times New Roman"/>
           <w:sz w:val="24"/>
           <w:szCs w:val="24"/>
         </w:rPr>
@@ -258,22 +170,37 @@
         <w:pStyle w:val="NoSpacing"/>
         <w:ind w:firstLine="709"/>
         <w:rPr>
+          <w:rFonts w:ascii="Times New Roman" w:hAnsi="Times New Roman" w:cs="Times New Roman"/>
+          <w:sz w:val="24"/>
+          <w:szCs w:val="24"/>
+          <w:highlight w:val="yellow"/>
+        </w:rPr>
+      </w:pPr>
+      <w:r>
+        <w:rPr>
+          <w:rFonts w:ascii="Times New Roman" w:hAnsi="Times New Roman" w:cs="Times New Roman"/>
+          <w:b/>
+          <w:bCs/>
+          <w:sz w:val="24"/>
+          <w:szCs w:val="24"/>
+        </w:rPr>
+        <w:t>Email:</w:t>
+      </w:r>
+      <w:r>
+        <w:rPr>
+          <w:rFonts w:ascii="Times New Roman" w:hAnsi="Times New Roman" w:cs="Times New Roman"/>
+          <w:sz w:val="24"/>
+          <w:szCs w:val="24"/>
+        </w:rPr>
+        <w:t xml:space="preserve"> </w:t>
+      </w:r>
+      <w:r>
+        <w:rPr>
           <w:rFonts w:ascii="Times New Roman" w:eastAsia="Times New Roman" w:hAnsi="Times New Roman" w:cs="Times New Roman"/>
-          <w:b/>
-          <w:bCs/>
-          <w:sz w:val="24"/>
-          <w:szCs w:val="24"/>
-        </w:rPr>
-      </w:pPr>
-      <w:r>
-        <w:rPr>
-          <w:rFonts w:ascii="Times New Roman" w:eastAsia="Times New Roman" w:hAnsi="Times New Roman" w:cs="Times New Roman"/>
-          <w:b/>
-          <w:bCs/>
-          <w:sz w:val="24"/>
-          <w:szCs w:val="24"/>
-        </w:rPr>
-        <w:t>{Trainee Address line2}</w:t>
+          <w:sz w:val="24"/>
+          <w:szCs w:val="24"/>
+        </w:rPr>
+        <w:t>{Email}</w:t>
       </w:r>
     </w:p>
     <w:p>
@@ -282,8 +209,6 @@
         <w:ind w:firstLine="709"/>
         <w:rPr>
           <w:rFonts w:ascii="Times New Roman" w:eastAsia="Times New Roman" w:hAnsi="Times New Roman" w:cs="Times New Roman"/>
-          <w:b/>
-          <w:bCs/>
           <w:sz w:val="24"/>
           <w:szCs w:val="24"/>
         </w:rPr>
@@ -296,37 +221,86 @@
           <w:sz w:val="24"/>
           <w:szCs w:val="24"/>
         </w:rPr>
+        <w:t xml:space="preserve">Address: </w:t>
+      </w:r>
+      <w:r>
+        <w:rPr>
+          <w:rFonts w:ascii="Times New Roman" w:eastAsia="Times New Roman" w:hAnsi="Times New Roman" w:cs="Times New Roman"/>
+          <w:sz w:val="24"/>
+          <w:szCs w:val="24"/>
+        </w:rPr>
+        <w:t>{Trainee Address</w:t>
+      </w:r>
+      <w:r>
+        <w:rPr>
+          <w:rFonts w:ascii="Times New Roman" w:eastAsia="Times New Roman" w:hAnsi="Times New Roman" w:cs="Times New Roman"/>
+          <w:sz w:val="24"/>
+          <w:szCs w:val="24"/>
+        </w:rPr>
+        <w:t xml:space="preserve"> line1</w:t>
+      </w:r>
+      <w:r>
+        <w:rPr>
+          <w:rFonts w:ascii="Times New Roman" w:eastAsia="Times New Roman" w:hAnsi="Times New Roman" w:cs="Times New Roman"/>
+          <w:sz w:val="24"/>
+          <w:szCs w:val="24"/>
+        </w:rPr>
+        <w:t>}</w:t>
+      </w:r>
+    </w:p>
+    <w:p>
+      <w:pPr>
+        <w:pStyle w:val="NoSpacing"/>
+        <w:ind w:firstLine="709"/>
+        <w:rPr>
+          <w:rFonts w:ascii="Times New Roman" w:eastAsia="Times New Roman" w:hAnsi="Times New Roman" w:cs="Times New Roman"/>
+          <w:sz w:val="24"/>
+          <w:szCs w:val="24"/>
+        </w:rPr>
+      </w:pPr>
+      <w:r>
+        <w:rPr>
+          <w:rFonts w:ascii="Times New Roman" w:eastAsia="Times New Roman" w:hAnsi="Times New Roman" w:cs="Times New Roman"/>
+          <w:sz w:val="24"/>
+          <w:szCs w:val="24"/>
+        </w:rPr>
+        <w:t>{Trainee Address line2}</w:t>
+      </w:r>
+    </w:p>
+    <w:p>
+      <w:pPr>
+        <w:pStyle w:val="NoSpacing"/>
+        <w:ind w:firstLine="709"/>
+        <w:rPr>
+          <w:rFonts w:ascii="Times New Roman" w:eastAsia="Times New Roman" w:hAnsi="Times New Roman" w:cs="Times New Roman"/>
+          <w:sz w:val="24"/>
+          <w:szCs w:val="24"/>
+        </w:rPr>
+      </w:pPr>
+      <w:r>
+        <w:rPr>
+          <w:rFonts w:ascii="Times New Roman" w:eastAsia="Times New Roman" w:hAnsi="Times New Roman" w:cs="Times New Roman"/>
+          <w:sz w:val="24"/>
+          <w:szCs w:val="24"/>
+        </w:rPr>
         <w:t>{Trainee Address line3}</w:t>
       </w:r>
     </w:p>
     <w:p>
       <w:pPr>
-        <w:spacing w:before="90"/>
-        <w:ind w:left="116" w:right="6655" w:firstLine="593"/>
-        <w:jc w:val="both"/>
-        <w:rPr>
-          <w:b/>
-          <w:bCs/>
-          <w:sz w:val="24"/>
-          <w:szCs w:val="24"/>
-        </w:rPr>
-      </w:pPr>
-    </w:p>
-    <w:p>
-      <w:pPr>
-        <w:spacing w:before="90"/>
-        <w:ind w:left="116" w:right="7407" w:firstLine="593"/>
-        <w:jc w:val="both"/>
-        <w:rPr>
-          <w:b/>
-          <w:bCs/>
-          <w:sz w:val="24"/>
-          <w:szCs w:val="24"/>
-          <w:highlight w:val="yellow"/>
-        </w:rPr>
-      </w:pPr>
-      <w:r>
-        <w:rPr>
+        <w:pStyle w:val="NoSpacing"/>
+        <w:ind w:firstLine="709"/>
+        <w:rPr>
+          <w:rFonts w:ascii="Times New Roman" w:eastAsia="Times New Roman" w:hAnsi="Times New Roman" w:cs="Times New Roman"/>
+          <w:b/>
+          <w:bCs/>
+          <w:sz w:val="24"/>
+          <w:szCs w:val="24"/>
+        </w:rPr>
+      </w:pPr>
+      <w:r>
+        <w:rPr>
+          <w:rFonts w:ascii="Times New Roman" w:hAnsi="Times New Roman" w:cs="Times New Roman"/>
           <w:b/>
           <w:bCs/>
           <w:sz w:val="24"/>
@@ -336,6 +310,7 @@
       </w:r>
       <w:r>
         <w:rPr>
+          <w:rFonts w:ascii="Times New Roman" w:hAnsi="Times New Roman" w:cs="Times New Roman"/>
           <w:b/>
           <w:bCs/>
           <w:spacing w:val="-1"/>
@@ -346,15 +321,26 @@
       </w:r>
       <w:r>
         <w:rPr>
-          <w:b/>
-          <w:bCs/>
-          <w:sz w:val="24"/>
-          <w:szCs w:val="24"/>
-        </w:rPr>
-        <w:t xml:space="preserve">No: </w:t>
-      </w:r>
-      <w:r>
-        <w:rPr>
+          <w:rFonts w:ascii="Times New Roman" w:hAnsi="Times New Roman" w:cs="Times New Roman"/>
+          <w:b/>
+          <w:bCs/>
+          <w:sz w:val="24"/>
+          <w:szCs w:val="24"/>
+        </w:rPr>
+        <w:t>No</w:t>
+      </w:r>
+      <w:r>
+        <w:rPr>
+          <w:b/>
+          <w:bCs/>
+          <w:sz w:val="24"/>
+          <w:szCs w:val="24"/>
+        </w:rPr>
+        <w:t xml:space="preserve">: </w:t>
+      </w:r>
+      <w:r>
+        <w:rPr>
+          <w:rFonts w:ascii="Times New Roman" w:eastAsia="Times New Roman" w:hAnsi="Times New Roman" w:cs="Times New Roman"/>
           <w:sz w:val="24"/>
           <w:szCs w:val="24"/>
         </w:rPr>
@@ -577,548 +563,541 @@
     </w:p>
     <w:p>
       <w:pPr>
-        <w:pStyle w:val="BodyText"/>
-        <w:spacing w:before="2"/>
-        <w:ind w:firstLine="593"/>
-        <w:jc w:val="both"/>
-        <w:rPr>
-          <w:b/>
-        </w:rPr>
-      </w:pPr>
+        <w:pStyle w:val="Heading1"/>
+        <w:ind w:left="0" w:firstLine="709"/>
+        <w:jc w:val="both"/>
+        <w:rPr>
+          <w:u w:val="thick"/>
+        </w:rPr>
+      </w:pPr>
+      <w:r>
+        <w:rPr>
+          <w:u w:val="thick"/>
+        </w:rPr>
+        <w:t>Joining</w:t>
+      </w:r>
+      <w:r>
+        <w:rPr>
+          <w:spacing w:val="-2"/>
+          <w:u w:val="thick"/>
+        </w:rPr>
+        <w:t xml:space="preserve"> </w:t>
+      </w:r>
+      <w:r>
+        <w:rPr>
+          <w:u w:val="thick"/>
+        </w:rPr>
+        <w:t>Date</w:t>
+      </w:r>
+      <w:r>
+        <w:rPr>
+          <w:spacing w:val="-2"/>
+          <w:u w:val="thick"/>
+        </w:rPr>
+        <w:t xml:space="preserve"> </w:t>
+      </w:r>
+      <w:r>
+        <w:rPr>
+          <w:u w:val="thick"/>
+        </w:rPr>
+        <w:t>and</w:t>
+      </w:r>
+      <w:r>
+        <w:rPr>
+          <w:spacing w:val="-2"/>
+          <w:u w:val="thick"/>
+        </w:rPr>
+        <w:t xml:space="preserve"> </w:t>
+      </w:r>
+      <w:r>
+        <w:rPr>
+          <w:u w:val="thick"/>
+        </w:rPr>
+        <w:t>Salary</w:t>
+      </w:r>
     </w:p>
     <w:p>
       <w:pPr>
         <w:pStyle w:val="Heading1"/>
         <w:ind w:left="709"/>
         <w:jc w:val="both"/>
-        <w:rPr>
-          <w:u w:val="thick"/>
-        </w:rPr>
-      </w:pPr>
-      <w:r>
-        <w:rPr>
-          <w:u w:val="thick"/>
-        </w:rPr>
-        <w:t>Joining</w:t>
-      </w:r>
-      <w:r>
-        <w:rPr>
-          <w:spacing w:val="-2"/>
-          <w:u w:val="thick"/>
-        </w:rPr>
-        <w:t xml:space="preserve"> </w:t>
-      </w:r>
-      <w:r>
-        <w:rPr>
-          <w:u w:val="thick"/>
-        </w:rPr>
-        <w:t>Date</w:t>
-      </w:r>
-      <w:r>
-        <w:rPr>
-          <w:spacing w:val="-2"/>
-          <w:u w:val="thick"/>
-        </w:rPr>
-        <w:t xml:space="preserve"> </w:t>
-      </w:r>
-      <w:r>
-        <w:rPr>
-          <w:u w:val="thick"/>
+      </w:pPr>
+    </w:p>
+    <w:p>
+      <w:pPr>
+        <w:ind w:left="709" w:right="702"/>
+        <w:jc w:val="both"/>
+        <w:rPr>
+          <w:sz w:val="24"/>
+          <w:szCs w:val="24"/>
+        </w:rPr>
+      </w:pPr>
+      <w:r>
+        <w:rPr>
+          <w:sz w:val="24"/>
+          <w:szCs w:val="24"/>
+        </w:rPr>
+        <w:t xml:space="preserve">You are </w:t>
+      </w:r>
+      <w:r>
+        <w:rPr>
+          <w:sz w:val="24"/>
+          <w:szCs w:val="24"/>
+        </w:rPr>
+        <w:t xml:space="preserve">appointed as </w:t>
+      </w:r>
+      <w:r>
+        <w:rPr>
+          <w:b/>
+          <w:bCs/>
+          <w:sz w:val="24"/>
+          <w:szCs w:val="24"/>
+        </w:rPr>
+        <w:t>{Designation}</w:t>
+      </w:r>
+      <w:r>
+        <w:rPr>
+          <w:b/>
+          <w:bCs/>
+          <w:sz w:val="24"/>
+          <w:szCs w:val="24"/>
+        </w:rPr>
+        <w:t xml:space="preserve"> </w:t>
+      </w:r>
+      <w:r>
+        <w:rPr>
+          <w:sz w:val="24"/>
+          <w:szCs w:val="24"/>
+        </w:rPr>
+        <w:t xml:space="preserve">with effect from </w:t>
+      </w:r>
+      <w:r>
+        <w:rPr>
+          <w:b/>
+          <w:bCs/>
+          <w:sz w:val="24"/>
+          <w:szCs w:val="24"/>
+        </w:rPr>
+        <w:t>{Date of Joining}</w:t>
+      </w:r>
+      <w:r>
+        <w:rPr>
+          <w:b/>
+          <w:bCs/>
+          <w:sz w:val="24"/>
+          <w:szCs w:val="24"/>
+        </w:rPr>
+        <w:t xml:space="preserve">. </w:t>
+      </w:r>
+      <w:r>
+        <w:rPr>
+          <w:sz w:val="24"/>
+          <w:szCs w:val="24"/>
+        </w:rPr>
+        <w:t>Your gross annual cost to company</w:t>
+      </w:r>
+      <w:r>
+        <w:rPr>
+          <w:spacing w:val="1"/>
+          <w:sz w:val="24"/>
+          <w:szCs w:val="24"/>
+        </w:rPr>
+        <w:t xml:space="preserve"> </w:t>
+      </w:r>
+      <w:r>
+        <w:rPr>
+          <w:sz w:val="24"/>
+          <w:szCs w:val="24"/>
+        </w:rPr>
+        <w:t xml:space="preserve">on </w:t>
+      </w:r>
+      <w:r>
+        <w:rPr>
+          <w:sz w:val="24"/>
+          <w:szCs w:val="24"/>
+        </w:rPr>
+        <w:t>jo</w:t>
+      </w:r>
+      <w:r>
+        <w:rPr>
+          <w:sz w:val="24"/>
+          <w:szCs w:val="24"/>
+        </w:rPr>
+        <w:t xml:space="preserve">ining InTimeTec Visionsoft Pvt. Ltd. is </w:t>
+      </w:r>
+      <w:r>
+        <w:rPr>
+          <w:b/>
+          <w:bCs/>
+          <w:sz w:val="24"/>
+          <w:szCs w:val="24"/>
+        </w:rPr>
+        <w:t>Rs 5,50,000/- (Five Lakh Fifty Thousand per annum only)</w:t>
+      </w:r>
+      <w:r>
+        <w:rPr>
+          <w:b/>
+          <w:bCs/>
+          <w:sz w:val="24"/>
+          <w:szCs w:val="24"/>
+        </w:rPr>
+        <w:t xml:space="preserve">. </w:t>
+      </w:r>
+      <w:r>
+        <w:rPr>
+          <w:sz w:val="24"/>
+          <w:szCs w:val="24"/>
+        </w:rPr>
+        <w:t>The monthly remuneration for each calendar month shall be paid within the first week of the immediately succeeding month. In the event an individual joins on or before the 24th day of the calendar month, remuneration for such month shall be paid in the first week of the following month. Where the date of joining is after the 24th day of a calendar month, the remuneration accrued for the partial month, and the subsequent month shall be paid together in the first week of the next succeeding month.</w:t>
+      </w:r>
+    </w:p>
+    <w:p>
+      <w:pPr>
+        <w:ind w:left="172" w:right="995"/>
+        <w:jc w:val="both"/>
+        <w:rPr>
+          <w:b/>
+          <w:sz w:val="24"/>
+          <w:szCs w:val="24"/>
+        </w:rPr>
+      </w:pPr>
+    </w:p>
+    <w:p>
+      <w:pPr>
+        <w:pStyle w:val="BodyText"/>
+        <w:ind w:left="426" w:firstLine="283"/>
+        <w:jc w:val="both"/>
+        <w:rPr>
+          <w:b/>
+          <w:u w:val="single"/>
+        </w:rPr>
+      </w:pPr>
+      <w:r>
+        <w:rPr>
+          <w:b/>
+          <w:u w:val="single"/>
+        </w:rPr>
+        <w:t>Training</w:t>
+      </w:r>
+      <w:r>
+        <w:rPr>
+          <w:b/>
+          <w:u w:val="single"/>
+        </w:rPr>
+        <w:t xml:space="preserve"> Period &amp; Confirmation</w:t>
+      </w:r>
+    </w:p>
+    <w:p>
+      <w:pPr>
+        <w:pStyle w:val="BodyText"/>
+        <w:ind w:left="426"/>
+        <w:jc w:val="both"/>
+        <w:rPr>
+          <w:b/>
+        </w:rPr>
+      </w:pPr>
+    </w:p>
+    <w:p>
+      <w:pPr>
+        <w:spacing w:line="259" w:lineRule="auto"/>
+        <w:ind w:left="709" w:right="702"/>
+        <w:jc w:val="both"/>
+        <w:rPr>
+          <w:sz w:val="24"/>
+          <w:szCs w:val="24"/>
+        </w:rPr>
+      </w:pPr>
+      <w:r>
+        <w:rPr>
+          <w:sz w:val="24"/>
+          <w:szCs w:val="24"/>
+        </w:rPr>
+        <w:t xml:space="preserve">Since you have successfully completed your </w:t>
+      </w:r>
+      <w:r>
+        <w:rPr>
+          <w:sz w:val="24"/>
+          <w:szCs w:val="24"/>
+        </w:rPr>
+        <w:t>training</w:t>
+      </w:r>
+      <w:r>
+        <w:rPr>
+          <w:sz w:val="24"/>
+          <w:szCs w:val="24"/>
+        </w:rPr>
+        <w:t xml:space="preserve"> period</w:t>
+      </w:r>
+      <w:r>
+        <w:rPr>
+          <w:sz w:val="24"/>
+          <w:szCs w:val="24"/>
+        </w:rPr>
+        <w:t xml:space="preserve">, </w:t>
+      </w:r>
+      <w:r>
+        <w:rPr>
+          <w:sz w:val="24"/>
+          <w:szCs w:val="24"/>
+        </w:rPr>
+        <w:t xml:space="preserve">you </w:t>
+      </w:r>
+      <w:r>
+        <w:rPr>
+          <w:sz w:val="24"/>
+          <w:szCs w:val="24"/>
+        </w:rPr>
+        <w:t xml:space="preserve">are being </w:t>
+      </w:r>
+      <w:r>
+        <w:rPr>
+          <w:sz w:val="24"/>
+          <w:szCs w:val="24"/>
+        </w:rPr>
+        <w:t>confirmed employee of the</w:t>
+      </w:r>
+      <w:r>
+        <w:rPr>
+          <w:sz w:val="24"/>
+          <w:szCs w:val="24"/>
+        </w:rPr>
+        <w:t xml:space="preserve"> </w:t>
+      </w:r>
+      <w:r>
+        <w:rPr>
+          <w:sz w:val="24"/>
+          <w:szCs w:val="24"/>
+        </w:rPr>
+        <w:t xml:space="preserve">company. The company reserves the right to </w:t>
+      </w:r>
+      <w:r>
+        <w:rPr>
+          <w:sz w:val="24"/>
+          <w:szCs w:val="24"/>
+        </w:rPr>
+        <w:t xml:space="preserve">make the change in </w:t>
+      </w:r>
+      <w:r>
+        <w:rPr>
+          <w:sz w:val="24"/>
+          <w:szCs w:val="24"/>
+        </w:rPr>
+        <w:t>your employment if your performance fails to meet the expectations set by the company.</w:t>
+      </w:r>
+    </w:p>
+    <w:p>
+      <w:pPr>
+        <w:spacing w:line="259" w:lineRule="auto"/>
+        <w:ind w:left="709" w:right="702"/>
+        <w:jc w:val="both"/>
+        <w:rPr>
+          <w:sz w:val="24"/>
+          <w:szCs w:val="24"/>
+        </w:rPr>
+      </w:pPr>
+      <w:r>
+        <w:rPr>
+          <w:rFonts w:eastAsiaTheme="minorEastAsia"/>
+          <w:sz w:val="24"/>
+          <w:szCs w:val="24"/>
+        </w:rPr>
+        <w:t>If you, for any reason, leave the Company within two months of confirmation as an employee, then, you shall forthwith</w:t>
+      </w:r>
+      <w:bookmarkStart w:id="0" w:name="_Hlk142386456"/>
+      <w:r>
+        <w:rPr>
+          <w:rFonts w:eastAsiaTheme="minorEastAsia"/>
+          <w:sz w:val="24"/>
+          <w:szCs w:val="24"/>
+        </w:rPr>
+        <w:t xml:space="preserve"> </w:t>
+      </w:r>
+      <w:r>
+        <w:rPr>
+          <w:rFonts w:eastAsiaTheme="minorEastAsia"/>
+          <w:sz w:val="24"/>
+          <w:szCs w:val="24"/>
+        </w:rPr>
+        <w:t xml:space="preserve">repay </w:t>
+      </w:r>
+      <w:r>
+        <w:rPr>
+          <w:rFonts w:eastAsiaTheme="minorEastAsia"/>
+          <w:sz w:val="24"/>
+          <w:szCs w:val="24"/>
+        </w:rPr>
+        <w:t>the company a sum total of the amount you have received as stipend</w:t>
+      </w:r>
+      <w:r>
+        <w:rPr>
+          <w:rFonts w:eastAsiaTheme="minorEastAsia"/>
+          <w:sz w:val="24"/>
+          <w:szCs w:val="24"/>
+        </w:rPr>
+        <w:t xml:space="preserve"> as trainee during your training period</w:t>
+      </w:r>
+      <w:r>
+        <w:rPr>
+          <w:rFonts w:eastAsiaTheme="minorEastAsia"/>
+          <w:sz w:val="24"/>
+          <w:szCs w:val="24"/>
+        </w:rPr>
+        <w:t xml:space="preserve"> </w:t>
+      </w:r>
+      <w:r>
+        <w:rPr>
+          <w:rFonts w:eastAsiaTheme="minorEastAsia"/>
+          <w:sz w:val="24"/>
+          <w:szCs w:val="24"/>
         </w:rPr>
         <w:t>and</w:t>
       </w:r>
       <w:r>
         <w:rPr>
-          <w:spacing w:val="-2"/>
-          <w:u w:val="thick"/>
-        </w:rPr>
-        <w:t xml:space="preserve"> </w:t>
-      </w:r>
-      <w:r>
-        <w:rPr>
-          <w:u w:val="thick"/>
-        </w:rPr>
-        <w:t>Salary</w:t>
-      </w:r>
+          <w:rFonts w:eastAsiaTheme="minorEastAsia"/>
+          <w:sz w:val="24"/>
+          <w:szCs w:val="24"/>
+        </w:rPr>
+        <w:t xml:space="preserve"> as salary (Cost to Company) starting from the period you </w:t>
+      </w:r>
+      <w:r>
+        <w:rPr>
+          <w:rFonts w:eastAsiaTheme="minorEastAsia"/>
+          <w:sz w:val="24"/>
+          <w:szCs w:val="24"/>
+        </w:rPr>
+        <w:t>g</w:t>
+      </w:r>
+      <w:r>
+        <w:rPr>
+          <w:rFonts w:eastAsiaTheme="minorEastAsia"/>
+          <w:sz w:val="24"/>
+          <w:szCs w:val="24"/>
+        </w:rPr>
+        <w:t xml:space="preserve">ot confirmed as an employee </w:t>
+      </w:r>
+      <w:r>
+        <w:rPr>
+          <w:rFonts w:eastAsiaTheme="minorEastAsia"/>
+          <w:sz w:val="24"/>
+          <w:szCs w:val="24"/>
+        </w:rPr>
+        <w:t xml:space="preserve">in </w:t>
+      </w:r>
+      <w:r>
+        <w:rPr>
+          <w:rFonts w:eastAsiaTheme="minorEastAsia"/>
+          <w:sz w:val="24"/>
+          <w:szCs w:val="24"/>
+        </w:rPr>
+        <w:t>the company</w:t>
+      </w:r>
+      <w:bookmarkEnd w:id="0"/>
+      <w:r>
+        <w:rPr>
+          <w:sz w:val="24"/>
+          <w:szCs w:val="24"/>
+        </w:rPr>
+        <w:t>.</w:t>
+      </w:r>
+    </w:p>
+    <w:p>
+      <w:pPr>
+        <w:pStyle w:val="BodyText"/>
+        <w:jc w:val="both"/>
+      </w:pPr>
     </w:p>
     <w:p>
       <w:pPr>
         <w:pStyle w:val="Heading1"/>
         <w:ind w:left="709"/>
         <w:jc w:val="both"/>
-      </w:pPr>
-    </w:p>
-    <w:p>
-      <w:pPr>
-        <w:ind w:left="709" w:right="702"/>
-        <w:jc w:val="both"/>
-        <w:rPr>
-          <w:sz w:val="24"/>
-          <w:szCs w:val="24"/>
-        </w:rPr>
-      </w:pPr>
-      <w:r>
-        <w:rPr>
-          <w:sz w:val="24"/>
-          <w:szCs w:val="24"/>
-        </w:rPr>
-        <w:t xml:space="preserve">You are </w:t>
-      </w:r>
-      <w:r>
-        <w:rPr>
-          <w:sz w:val="24"/>
-          <w:szCs w:val="24"/>
-        </w:rPr>
-        <w:t xml:space="preserve">appointed as </w:t>
-      </w:r>
-      <w:r>
-        <w:rPr>
-          <w:b/>
-          <w:bCs/>
-          <w:sz w:val="24"/>
-          <w:szCs w:val="24"/>
-        </w:rPr>
-        <w:t>{Designation}</w:t>
-      </w:r>
-      <w:r>
-        <w:rPr>
-          <w:b/>
-          <w:bCs/>
-          <w:sz w:val="24"/>
-          <w:szCs w:val="24"/>
-        </w:rPr>
-        <w:t xml:space="preserve"> </w:t>
-      </w:r>
-      <w:r>
-        <w:rPr>
-          <w:sz w:val="24"/>
-          <w:szCs w:val="24"/>
-        </w:rPr>
-        <w:t xml:space="preserve">with effect from </w:t>
-      </w:r>
-      <w:r>
-        <w:rPr>
-          <w:b/>
-          <w:bCs/>
-          <w:sz w:val="24"/>
-          <w:szCs w:val="24"/>
-        </w:rPr>
-        <w:t>{Date of Joining}</w:t>
-      </w:r>
-      <w:r>
-        <w:rPr>
-          <w:b/>
-          <w:bCs/>
-          <w:sz w:val="24"/>
-          <w:szCs w:val="24"/>
-        </w:rPr>
-        <w:t xml:space="preserve">. </w:t>
-      </w:r>
-      <w:r>
-        <w:rPr>
-          <w:sz w:val="24"/>
-          <w:szCs w:val="24"/>
-        </w:rPr>
-        <w:t>Your gross annual cost to company</w:t>
-      </w:r>
-      <w:r>
-        <w:rPr>
-          <w:spacing w:val="1"/>
-          <w:sz w:val="24"/>
-          <w:szCs w:val="24"/>
-        </w:rPr>
-        <w:t xml:space="preserve"> </w:t>
-      </w:r>
-      <w:r>
-        <w:rPr>
-          <w:sz w:val="24"/>
-          <w:szCs w:val="24"/>
-        </w:rPr>
-        <w:t xml:space="preserve">on </w:t>
-      </w:r>
-      <w:r>
-        <w:rPr>
-          <w:sz w:val="24"/>
-          <w:szCs w:val="24"/>
-        </w:rPr>
-        <w:t>jo</w:t>
-      </w:r>
-      <w:r>
-        <w:rPr>
-          <w:sz w:val="24"/>
-          <w:szCs w:val="24"/>
-        </w:rPr>
-        <w:t xml:space="preserve">ining InTimeTec Visionsoft Pvt. Ltd. is </w:t>
-      </w:r>
-      <w:r>
-        <w:rPr>
-          <w:b/>
-          <w:bCs/>
-          <w:sz w:val="24"/>
-          <w:szCs w:val="24"/>
-        </w:rPr>
-        <w:t>Rs 5,50,000/- (Five Lakh Fifty Thousand per annum only)</w:t>
-      </w:r>
-      <w:r>
-        <w:rPr>
-          <w:b/>
-          <w:bCs/>
-          <w:sz w:val="24"/>
-          <w:szCs w:val="24"/>
-        </w:rPr>
-        <w:t xml:space="preserve">. </w:t>
-      </w:r>
-      <w:r>
-        <w:rPr>
-          <w:sz w:val="24"/>
-          <w:szCs w:val="24"/>
-        </w:rPr>
-        <w:t>The monthly remuneration for each calendar month shall be paid within the first week of the immediately succeeding month. In the event an individual joins on or before the 24th day of the calendar month, remuneration for such month shall be paid in the first week of the following month. Where the date of joining is after the 24th day of a calendar month, the remuneration accrued for the partial month, and the subsequent month shall be paid together in the first week of the next succeeding month.</w:t>
-      </w:r>
-    </w:p>
-    <w:p>
-      <w:pPr>
-        <w:ind w:left="172" w:right="995"/>
-        <w:jc w:val="both"/>
-        <w:rPr>
-          <w:b/>
-          <w:sz w:val="24"/>
-          <w:szCs w:val="24"/>
-        </w:rPr>
-      </w:pPr>
-    </w:p>
-    <w:p>
-      <w:pPr>
-        <w:pStyle w:val="BodyText"/>
-        <w:ind w:left="426" w:firstLine="283"/>
-        <w:jc w:val="both"/>
-        <w:rPr>
-          <w:b/>
-          <w:u w:val="single"/>
-        </w:rPr>
-      </w:pPr>
-      <w:r>
-        <w:rPr>
-          <w:b/>
-          <w:u w:val="single"/>
-        </w:rPr>
-        <w:t>Training</w:t>
-      </w:r>
-      <w:r>
-        <w:rPr>
-          <w:b/>
-          <w:u w:val="single"/>
-        </w:rPr>
-        <w:t xml:space="preserve"> Period &amp; Confirmation</w:t>
-      </w:r>
-    </w:p>
-    <w:p>
-      <w:pPr>
-        <w:pStyle w:val="BodyText"/>
-        <w:ind w:left="426"/>
-        <w:jc w:val="both"/>
-        <w:rPr>
-          <w:b/>
-        </w:rPr>
-      </w:pPr>
-    </w:p>
-    <w:p>
-      <w:pPr>
-        <w:spacing w:line="259" w:lineRule="auto"/>
-        <w:ind w:left="709" w:right="702"/>
-        <w:jc w:val="both"/>
-        <w:rPr>
-          <w:sz w:val="24"/>
-          <w:szCs w:val="24"/>
-        </w:rPr>
-      </w:pPr>
-      <w:r>
-        <w:rPr>
-          <w:sz w:val="24"/>
-          <w:szCs w:val="24"/>
-        </w:rPr>
-        <w:t xml:space="preserve">Since you have successfully completed your </w:t>
-      </w:r>
-      <w:r>
-        <w:rPr>
-          <w:sz w:val="24"/>
-          <w:szCs w:val="24"/>
-        </w:rPr>
-        <w:t>training</w:t>
-      </w:r>
-      <w:r>
-        <w:rPr>
-          <w:sz w:val="24"/>
-          <w:szCs w:val="24"/>
-        </w:rPr>
-        <w:t xml:space="preserve"> period</w:t>
-      </w:r>
-      <w:r>
-        <w:rPr>
-          <w:sz w:val="24"/>
-          <w:szCs w:val="24"/>
-        </w:rPr>
-        <w:t xml:space="preserve">, </w:t>
-      </w:r>
-      <w:r>
-        <w:rPr>
-          <w:sz w:val="24"/>
-          <w:szCs w:val="24"/>
-        </w:rPr>
-        <w:t xml:space="preserve">you </w:t>
-      </w:r>
-      <w:r>
-        <w:rPr>
-          <w:sz w:val="24"/>
-          <w:szCs w:val="24"/>
-        </w:rPr>
-        <w:t xml:space="preserve">are being </w:t>
-      </w:r>
-      <w:r>
-        <w:rPr>
-          <w:sz w:val="24"/>
-          <w:szCs w:val="24"/>
-        </w:rPr>
-        <w:t>confirmed employee of the</w:t>
-      </w:r>
-      <w:r>
-        <w:rPr>
-          <w:sz w:val="24"/>
-          <w:szCs w:val="24"/>
-        </w:rPr>
-        <w:t xml:space="preserve"> </w:t>
-      </w:r>
-      <w:r>
-        <w:rPr>
-          <w:sz w:val="24"/>
-          <w:szCs w:val="24"/>
-        </w:rPr>
-        <w:t xml:space="preserve">company. The company reserves the right to </w:t>
-      </w:r>
-      <w:r>
-        <w:rPr>
-          <w:sz w:val="24"/>
-          <w:szCs w:val="24"/>
-        </w:rPr>
-        <w:t xml:space="preserve">make the change in </w:t>
-      </w:r>
-      <w:r>
-        <w:rPr>
-          <w:sz w:val="24"/>
-          <w:szCs w:val="24"/>
-        </w:rPr>
-        <w:t>your employment if your performance fails to meet the expectations set by the company.</w:t>
-      </w:r>
-    </w:p>
-    <w:p>
-      <w:pPr>
-        <w:spacing w:line="259" w:lineRule="auto"/>
-        <w:ind w:left="709" w:right="702"/>
-        <w:jc w:val="both"/>
-        <w:rPr>
-          <w:sz w:val="24"/>
-          <w:szCs w:val="24"/>
-        </w:rPr>
-      </w:pPr>
-    </w:p>
-    <w:p>
-      <w:pPr>
-        <w:pStyle w:val="BodyText"/>
-        <w:ind w:left="709" w:right="702"/>
-        <w:jc w:val="both"/>
-        <w:rPr>
-          <w:sz w:val="22"/>
-          <w:szCs w:val="22"/>
-        </w:rPr>
-      </w:pPr>
-      <w:r>
-        <w:rPr>
-          <w:rFonts w:asciiTheme="minorHAnsi" w:eastAsiaTheme="minorEastAsia" w:hAnsiTheme="minorHAnsi" w:cstheme="minorBidi"/>
-        </w:rPr>
-        <w:t>If you, for any reason, leave the Company within two months of confirmation as an employee, then, you shall forthwith</w:t>
-      </w:r>
-      <w:bookmarkStart w:id="0" w:name="_Hlk142386456"/>
-      <w:r>
-        <w:rPr>
-          <w:rFonts w:asciiTheme="minorHAnsi" w:eastAsiaTheme="minorEastAsia" w:hAnsiTheme="minorHAnsi" w:cstheme="minorBidi"/>
-        </w:rPr>
-        <w:t xml:space="preserve"> </w:t>
-      </w:r>
-      <w:r>
-        <w:rPr>
-          <w:rFonts w:asciiTheme="minorHAnsi" w:eastAsiaTheme="minorEastAsia" w:hAnsiTheme="minorHAnsi" w:cstheme="minorBidi"/>
-        </w:rPr>
-        <w:t xml:space="preserve">repay </w:t>
-      </w:r>
-      <w:r>
-        <w:rPr>
-          <w:rFonts w:asciiTheme="minorHAnsi" w:eastAsiaTheme="minorEastAsia" w:hAnsiTheme="minorHAnsi" w:cstheme="minorBidi"/>
-        </w:rPr>
-        <w:t>the company a sum total of the amount you have received as stipend</w:t>
-      </w:r>
-      <w:r>
-        <w:rPr>
-          <w:rFonts w:asciiTheme="minorHAnsi" w:eastAsiaTheme="minorEastAsia" w:hAnsiTheme="minorHAnsi" w:cstheme="minorBidi"/>
-        </w:rPr>
-        <w:t xml:space="preserve"> as trainee during your training period</w:t>
-      </w:r>
-      <w:r>
-        <w:rPr>
-          <w:rFonts w:asciiTheme="minorHAnsi" w:eastAsiaTheme="minorEastAsia" w:hAnsiTheme="minorHAnsi" w:cstheme="minorBidi"/>
-        </w:rPr>
-        <w:t xml:space="preserve"> </w:t>
-      </w:r>
-      <w:r>
-        <w:rPr>
-          <w:rFonts w:asciiTheme="minorHAnsi" w:eastAsiaTheme="minorEastAsia" w:hAnsiTheme="minorHAnsi" w:cstheme="minorBidi"/>
-        </w:rPr>
-        <w:t>and</w:t>
-      </w:r>
-      <w:r>
-        <w:rPr>
-          <w:rFonts w:asciiTheme="minorHAnsi" w:eastAsiaTheme="minorEastAsia" w:hAnsiTheme="minorHAnsi" w:cstheme="minorBidi"/>
-        </w:rPr>
-        <w:t xml:space="preserve"> as salary (Cost to Company) starting from the period you </w:t>
-      </w:r>
-      <w:r>
-        <w:rPr>
-          <w:rFonts w:asciiTheme="minorHAnsi" w:eastAsiaTheme="minorEastAsia" w:hAnsiTheme="minorHAnsi" w:cstheme="minorBidi"/>
-        </w:rPr>
-        <w:t>g</w:t>
-      </w:r>
-      <w:r>
-        <w:rPr>
-          <w:rFonts w:asciiTheme="minorHAnsi" w:eastAsiaTheme="minorEastAsia" w:hAnsiTheme="minorHAnsi" w:cstheme="minorBidi"/>
-        </w:rPr>
-        <w:t xml:space="preserve">ot confirmed as an employee </w:t>
-      </w:r>
-      <w:r>
-        <w:rPr>
-          <w:rFonts w:asciiTheme="minorHAnsi" w:eastAsiaTheme="minorEastAsia" w:hAnsiTheme="minorHAnsi" w:cstheme="minorBidi"/>
-        </w:rPr>
-        <w:t xml:space="preserve">in </w:t>
-      </w:r>
-      <w:r>
-        <w:rPr>
-          <w:rFonts w:asciiTheme="minorHAnsi" w:eastAsiaTheme="minorEastAsia" w:hAnsiTheme="minorHAnsi" w:cstheme="minorBidi"/>
-        </w:rPr>
-        <w:t>the company</w:t>
-      </w:r>
-      <w:bookmarkEnd w:id="0"/>
-      <w:r>
-        <w:rPr>
-          <w:sz w:val="22"/>
-          <w:szCs w:val="22"/>
-        </w:rPr>
-        <w:t>.</w:t>
-      </w:r>
-    </w:p>
-    <w:p>
-      <w:pPr>
-        <w:pStyle w:val="BodyText"/>
-        <w:jc w:val="both"/>
-      </w:pPr>
-    </w:p>
-    <w:p>
-      <w:pPr>
-        <w:pStyle w:val="Heading1"/>
-        <w:ind w:left="709"/>
-        <w:jc w:val="both"/>
         <w:rPr>
           <w:u w:val="thick"/>
         </w:rPr>
       </w:pPr>
-    </w:p>
-    <w:p>
-      <w:pPr>
-        <w:pStyle w:val="Heading1"/>
-        <w:ind w:left="709"/>
-        <w:jc w:val="both"/>
+      <w:r>
         <w:rPr>
           <w:u w:val="thick"/>
         </w:rPr>
-      </w:pPr>
-    </w:p>
-    <w:p>
-      <w:pPr>
-        <w:pStyle w:val="Heading1"/>
-        <w:ind w:left="709"/>
-        <w:jc w:val="both"/>
-        <w:rPr>
-          <w:u w:val="thick"/>
-        </w:rPr>
-      </w:pPr>
-      <w:r>
-        <w:rPr>
-          <w:u w:val="thick"/>
-        </w:rPr>
-        <w:lastRenderedPageBreak/>
         <w:t>Appraisals</w:t>
       </w:r>
     </w:p>
     <w:p>
       <w:pPr>
-        <w:pStyle w:val="Heading1"/>
-        <w:ind w:left="709"/>
-        <w:jc w:val="both"/>
-      </w:pPr>
-    </w:p>
-    <w:p>
-      <w:pPr>
-        <w:pStyle w:val="BodyText"/>
-        <w:tabs>
-          <w:tab w:val="left" w:pos="9214"/>
-        </w:tabs>
-        <w:spacing w:before="90"/>
-        <w:ind w:left="709" w:right="702"/>
-        <w:jc w:val="both"/>
-      </w:pPr>
-      <w:r>
+        <w:rPr>
+          <w:sz w:val="24"/>
+          <w:szCs w:val="24"/>
+        </w:rPr>
+      </w:pPr>
+    </w:p>
+    <w:p>
+      <w:pPr>
+        <w:ind w:firstLine="709"/>
+        <w:rPr>
+          <w:sz w:val="24"/>
+          <w:szCs w:val="24"/>
+        </w:rPr>
+      </w:pPr>
+      <w:r>
+        <w:rPr>
+          <w:sz w:val="24"/>
+          <w:szCs w:val="24"/>
+        </w:rPr>
         <w:t>Performance reviews and annual appraisals are done in the month of April and increments</w:t>
       </w:r>
       <w:r>
-        <w:t xml:space="preserve"> </w:t>
-      </w:r>
-      <w:r>
+        <w:rPr>
+          <w:sz w:val="24"/>
+          <w:szCs w:val="24"/>
+        </w:rPr>
+        <w:t xml:space="preserve"> </w:t>
+      </w:r>
+      <w:r>
+        <w:rPr>
+          <w:sz w:val="24"/>
+          <w:szCs w:val="24"/>
+        </w:rPr>
         <w:t>are</w:t>
       </w:r>
       <w:r>
+        <w:rPr>
+          <w:sz w:val="24"/>
+          <w:szCs w:val="24"/>
+        </w:rPr>
         <w:t xml:space="preserve"> </w:t>
       </w:r>
       <w:r>
         <w:rPr>
           <w:spacing w:val="-57"/>
-        </w:rPr>
-        <w:t xml:space="preserve"> </w:t>
-      </w:r>
-    </w:p>
-    <w:p>
-      <w:pPr>
-        <w:pStyle w:val="BodyText"/>
-        <w:tabs>
-          <w:tab w:val="left" w:pos="9214"/>
-        </w:tabs>
-        <w:spacing w:before="90"/>
-        <w:ind w:left="709" w:right="702"/>
-        <w:jc w:val="both"/>
-      </w:pPr>
-      <w:r>
+          <w:sz w:val="24"/>
+          <w:szCs w:val="24"/>
+        </w:rPr>
+        <w:t xml:space="preserve"> </w:t>
+      </w:r>
+    </w:p>
+    <w:p>
+      <w:pPr>
+        <w:ind w:firstLine="709"/>
+        <w:rPr>
+          <w:sz w:val="24"/>
+          <w:szCs w:val="24"/>
+        </w:rPr>
+      </w:pPr>
+      <w:r>
+        <w:rPr>
+          <w:sz w:val="24"/>
+          <w:szCs w:val="24"/>
+        </w:rPr>
         <w:t>therefore</w:t>
       </w:r>
       <w:r>
+        <w:rPr>
+          <w:sz w:val="24"/>
+          <w:szCs w:val="24"/>
+        </w:rPr>
         <w:t xml:space="preserve"> granted on merit according to the company policy.</w:t>
       </w:r>
-    </w:p>
-    <w:p>
-      <w:pPr>
-        <w:pStyle w:val="BodyText"/>
-        <w:tabs>
-          <w:tab w:val="left" w:pos="9214"/>
-        </w:tabs>
-        <w:spacing w:before="90"/>
-        <w:ind w:left="709" w:right="702"/>
-        <w:jc w:val="both"/>
-      </w:pPr>
     </w:p>
     <w:p>
       <w:pPr>
@@ -1130,70 +1109,6 @@
           <w:u w:val="thick"/>
         </w:rPr>
       </w:pPr>
-      <w:r>
-        <w:rPr>
-          <w:u w:val="thick"/>
-        </w:rPr>
-        <w:t>Place</w:t>
-      </w:r>
-      <w:r>
-        <w:rPr>
-          <w:spacing w:val="-1"/>
-          <w:u w:val="thick"/>
-        </w:rPr>
-        <w:t xml:space="preserve"> </w:t>
-      </w:r>
-      <w:r>
-        <w:rPr>
-          <w:u w:val="thick"/>
-        </w:rPr>
-        <w:t>of</w:t>
-      </w:r>
-      <w:r>
-        <w:rPr>
-          <w:spacing w:val="-2"/>
-          <w:u w:val="thick"/>
-        </w:rPr>
-        <w:t xml:space="preserve"> </w:t>
-      </w:r>
-      <w:r>
-        <w:rPr>
-          <w:u w:val="thick"/>
-        </w:rPr>
-        <w:t>Work</w:t>
-      </w:r>
-      <w:r>
-        <w:rPr>
-          <w:spacing w:val="-2"/>
-          <w:u w:val="thick"/>
-        </w:rPr>
-        <w:t xml:space="preserve"> </w:t>
-      </w:r>
-      <w:r>
-        <w:rPr>
-          <w:u w:val="thick"/>
-        </w:rPr>
-        <w:t>and</w:t>
-      </w:r>
-      <w:r>
-        <w:rPr>
-          <w:spacing w:val="-2"/>
-          <w:u w:val="thick"/>
-        </w:rPr>
-        <w:t xml:space="preserve"> </w:t>
-      </w:r>
-      <w:r>
-        <w:rPr>
-          <w:u w:val="thick"/>
-        </w:rPr>
-        <w:t>Mobility</w:t>
-      </w:r>
-      <w:r>
-        <w:rPr>
-          <w:u w:val="thick"/>
-        </w:rPr>
-        <w:t xml:space="preserve"> </w:t>
-      </w:r>
     </w:p>
     <w:p>
       <w:pPr>
@@ -1208,11 +1123,95 @@
     </w:p>
     <w:p>
       <w:pPr>
+        <w:pStyle w:val="Heading1"/>
+        <w:spacing w:before="216"/>
+        <w:ind w:left="172" w:firstLine="537"/>
+        <w:jc w:val="both"/>
+        <w:rPr>
+          <w:u w:val="thick"/>
+        </w:rPr>
+      </w:pPr>
+      <w:r>
+        <w:rPr>
+          <w:u w:val="thick"/>
+        </w:rPr>
+        <w:lastRenderedPageBreak/>
+        <w:t>Place</w:t>
+      </w:r>
+      <w:r>
+        <w:rPr>
+          <w:spacing w:val="-1"/>
+          <w:u w:val="thick"/>
+        </w:rPr>
+        <w:t xml:space="preserve"> </w:t>
+      </w:r>
+      <w:r>
+        <w:rPr>
+          <w:u w:val="thick"/>
+        </w:rPr>
+        <w:t>of</w:t>
+      </w:r>
+      <w:r>
+        <w:rPr>
+          <w:spacing w:val="-2"/>
+          <w:u w:val="thick"/>
+        </w:rPr>
+        <w:t xml:space="preserve"> </w:t>
+      </w:r>
+      <w:r>
+        <w:rPr>
+          <w:u w:val="thick"/>
+        </w:rPr>
+        <w:t>Work</w:t>
+      </w:r>
+      <w:r>
+        <w:rPr>
+          <w:spacing w:val="-2"/>
+          <w:u w:val="thick"/>
+        </w:rPr>
+        <w:t xml:space="preserve"> </w:t>
+      </w:r>
+      <w:r>
+        <w:rPr>
+          <w:u w:val="thick"/>
+        </w:rPr>
+        <w:t>and</w:t>
+      </w:r>
+      <w:r>
+        <w:rPr>
+          <w:spacing w:val="-2"/>
+          <w:u w:val="thick"/>
+        </w:rPr>
+        <w:t xml:space="preserve"> </w:t>
+      </w:r>
+      <w:r>
+        <w:rPr>
+          <w:u w:val="thick"/>
+        </w:rPr>
+        <w:t>Mobility</w:t>
+      </w:r>
+      <w:r>
+        <w:rPr>
+          <w:u w:val="thick"/>
+        </w:rPr>
+        <w:t xml:space="preserve"> </w:t>
+      </w:r>
+    </w:p>
+    <w:p>
+      <w:pPr>
         <w:pStyle w:val="BodyText"/>
         <w:spacing w:before="90"/>
         <w:ind w:left="709" w:right="702"/>
         <w:jc w:val="both"/>
       </w:pPr>
+    </w:p>
+    <w:p>
+      <w:pPr>
+        <w:pStyle w:val="BodyText"/>
+        <w:spacing w:before="90"/>
+        <w:ind w:left="709" w:right="702"/>
+        <w:jc w:val="both"/>
+      </w:pPr>
       <w:r>
         <w:t>You shall be based in</w:t>
       </w:r>
@@ -1745,7 +1744,19 @@
         <w:t>any business of any kind in which it is engaged</w:t>
       </w:r>
       <w:r>
-        <w:t xml:space="preserve">, </w:t>
+        <w:t>,</w:t>
+      </w:r>
+      <w:r>
+        <w:t xml:space="preserve"> </w:t>
+      </w:r>
+      <w:r>
+        <w:t>including, without limitation, the solicitation of or interference with any of its suppliers or c</w:t>
+      </w:r>
+      <w:r>
+        <w:t>lients</w:t>
+      </w:r>
+      <w:r>
+        <w:t xml:space="preserve">, or (ii) employ, solicit for employment, or recommend for employment any person employed by the </w:t>
       </w:r>
     </w:p>
     <w:p>
@@ -1755,6 +1766,42 @@
         <w:ind w:left="709" w:right="702"/>
         <w:jc w:val="both"/>
       </w:pPr>
+      <w:r>
+        <w:t>Company</w:t>
+      </w:r>
+      <w:r>
+        <w:t xml:space="preserve">, during the service </w:t>
+      </w:r>
+      <w:r>
+        <w:t>p</w:t>
+      </w:r>
+      <w:r>
+        <w:t xml:space="preserve">eriod and for a period of </w:t>
+      </w:r>
+      <w:r>
+        <w:t>Three</w:t>
+      </w:r>
+      <w:r>
+        <w:t xml:space="preserve"> </w:t>
+      </w:r>
+      <w:r>
+        <w:t>(3)</w:t>
+      </w:r>
+      <w:r>
+        <w:t xml:space="preserve"> year</w:t>
+      </w:r>
+      <w:r>
+        <w:t>s</w:t>
+      </w:r>
+      <w:r>
+        <w:t xml:space="preserve"> </w:t>
+      </w:r>
+      <w:r>
+        <w:t>thereafter</w:t>
+      </w:r>
+      <w:r>
+        <w:t xml:space="preserve"> and abide by the non-solicitation provisions mentioned in the Non-Disclosure and Assignment of Inventions Agreement</w:t>
+      </w:r>
     </w:p>
     <w:p>
       <w:pPr>
@@ -1763,67 +1810,6 @@
         <w:ind w:left="709" w:right="702"/>
         <w:jc w:val="both"/>
       </w:pPr>
-      <w:r>
-        <w:t>including, without limitation, the solicitation of or interference with any of its suppliers or c</w:t>
-      </w:r>
-      <w:r>
-        <w:t>lients</w:t>
-      </w:r>
-      <w:r>
-        <w:t xml:space="preserve">, or (ii) employ, solicit for employment, or recommend for employment any person employed by the </w:t>
-      </w:r>
-    </w:p>
-    <w:p>
-      <w:pPr>
-        <w:pStyle w:val="BodyText"/>
-        <w:spacing w:before="91"/>
-        <w:ind w:left="709" w:right="702"/>
-        <w:jc w:val="both"/>
-      </w:pPr>
-      <w:r>
-        <w:t>Company</w:t>
-      </w:r>
-      <w:r>
-        <w:t xml:space="preserve">, during the service </w:t>
-      </w:r>
-      <w:r>
-        <w:t>p</w:t>
-      </w:r>
-      <w:r>
-        <w:t xml:space="preserve">eriod and for a period of </w:t>
-      </w:r>
-      <w:r>
-        <w:t>Three</w:t>
-      </w:r>
-      <w:r>
-        <w:t xml:space="preserve"> </w:t>
-      </w:r>
-      <w:r>
-        <w:t>(3)</w:t>
-      </w:r>
-      <w:r>
-        <w:t xml:space="preserve"> year</w:t>
-      </w:r>
-      <w:r>
-        <w:t>s</w:t>
-      </w:r>
-      <w:r>
-        <w:t xml:space="preserve"> </w:t>
-      </w:r>
-      <w:r>
-        <w:t>thereafter</w:t>
-      </w:r>
-      <w:r>
-        <w:t xml:space="preserve"> and abide by the non-solicitation provisions mentioned in the Non-Disclosure and Assignment of Inventions Agreement</w:t>
-      </w:r>
-    </w:p>
-    <w:p>
-      <w:pPr>
-        <w:pStyle w:val="BodyText"/>
-        <w:spacing w:before="91"/>
-        <w:ind w:left="709" w:right="702"/>
-        <w:jc w:val="both"/>
-      </w:pPr>
     </w:p>
     <w:p>
       <w:pPr>
@@ -1845,6 +1831,7 @@
           <w:bCs/>
           <w:u w:val="single"/>
         </w:rPr>
+        <w:lastRenderedPageBreak/>
         <w:t>Non-Disparagement</w:t>
       </w:r>
       <w:r>
@@ -2233,7 +2220,15 @@
           <w:b w:val="0"/>
           <w:bCs w:val="0"/>
         </w:rPr>
-        <w:t xml:space="preserve">pay an amount equivalent to 60 (sixty) days salary/remuneration in lieu thereof prior to leaving the services of the Company. Similarly, if the Company decides to discontinue your services, it may do so by providing you with 60 (sixty) days </w:t>
+        <w:t>pay an amount equivalent to 60 (sixty) days salary/remuneration in lieu thereof prior to leaving the services of the Company. Similarly, if the Company decides to discontinue your services, it may do so by providing you with 60 (sixty) days prior notice or payment of a sum equivalent to your 60(sixty) days salary/remuneration in lieu of the notice period as per management discretion</w:t>
+      </w:r>
+      <w:r>
+        <w:rPr>
+          <w:color w:val="1F1E1D"/>
+          <w:sz w:val="22"/>
+          <w:szCs w:val="22"/>
+        </w:rPr>
+        <w:t>.</w:t>
       </w:r>
     </w:p>
     <w:p>
@@ -2243,67 +2238,17 @@
         <w:ind w:left="720" w:right="700"/>
         <w:jc w:val="both"/>
         <w:rPr>
-          <w:b w:val="0"/>
-          <w:bCs w:val="0"/>
-        </w:rPr>
-      </w:pPr>
-    </w:p>
-    <w:p>
-      <w:pPr>
-        <w:pStyle w:val="Heading1"/>
-        <w:spacing w:before="1"/>
-        <w:ind w:left="720" w:right="700"/>
-        <w:jc w:val="both"/>
-        <w:rPr>
-          <w:b w:val="0"/>
-          <w:bCs w:val="0"/>
-        </w:rPr>
-      </w:pPr>
-    </w:p>
-    <w:p>
-      <w:pPr>
-        <w:pStyle w:val="Heading1"/>
-        <w:spacing w:before="1"/>
-        <w:ind w:left="720" w:right="700"/>
-        <w:jc w:val="both"/>
-        <w:rPr>
-          <w:b w:val="0"/>
-          <w:bCs w:val="0"/>
-        </w:rPr>
-      </w:pPr>
-    </w:p>
-    <w:p>
-      <w:pPr>
-        <w:pStyle w:val="Heading1"/>
-        <w:spacing w:before="1"/>
-        <w:ind w:left="720" w:right="700"/>
-        <w:jc w:val="both"/>
-        <w:rPr>
-          <w:b w:val="0"/>
-          <w:bCs w:val="0"/>
-        </w:rPr>
-      </w:pPr>
-      <w:r>
-        <w:rPr>
-          <w:b w:val="0"/>
-          <w:bCs w:val="0"/>
-        </w:rPr>
-        <w:t>prior notice or payment of a sum equivalent to your 60(sixty) days salary/remuneration in lieu of the notice period as per management discretion</w:t>
-      </w:r>
-      <w:r>
-        <w:rPr>
           <w:color w:val="1F1E1D"/>
           <w:sz w:val="22"/>
           <w:szCs w:val="22"/>
         </w:rPr>
-        <w:t>.</w:t>
-      </w:r>
-    </w:p>
-    <w:p>
-      <w:pPr>
-        <w:pStyle w:val="Heading1"/>
-        <w:spacing w:before="1"/>
-        <w:ind w:left="720" w:right="700"/>
+      </w:pPr>
+    </w:p>
+    <w:p>
+      <w:pPr>
+        <w:pStyle w:val="BodyText"/>
+        <w:spacing w:before="90"/>
+        <w:ind w:left="709" w:right="702"/>
         <w:jc w:val="both"/>
         <w:rPr>
           <w:color w:val="1F1E1D"/>
@@ -2311,21 +2256,7 @@
           <w:szCs w:val="22"/>
         </w:rPr>
       </w:pPr>
-    </w:p>
-    <w:p>
-      <w:pPr>
-        <w:pStyle w:val="BodyText"/>
-        <w:spacing w:before="90"/>
-        <w:ind w:left="709" w:right="702"/>
-        <w:jc w:val="both"/>
-        <w:rPr>
-          <w:color w:val="1F1E1D"/>
-          <w:sz w:val="22"/>
-          <w:szCs w:val="22"/>
-        </w:rPr>
-      </w:pPr>
-      <w:r>
-        <w:lastRenderedPageBreak/>
+      <w:r>
         <w:t>Notwithstanding the foregoing, the Company reserves the right to terminate your  employment with immediate effect and without any notice or payment in lieu thereof if you are found to have engaged in dishonest, fraudulent, suspicious, or unethical conduct, including but not limited to misconduct, theft of Company property, providing incorrect information for/during background verification or false representations made</w:t>
       </w:r>
       <w:r>
@@ -2391,7 +2322,44 @@
           <w:b w:val="0"/>
           <w:bCs w:val="0"/>
         </w:rPr>
-        <w:t>From the day of joining, you shall be entitled to annual leave according to the Company’s rules and applicable policies. The company’s holiday year runs from the first day of January to the last day of December. The holidays are determined by the Company based on the office location of the Company to which you are assigned or based.</w:t>
+        <w:t xml:space="preserve">From the day of joining, you shall be entitled to annual leave according to the Company’s rules and applicable policies. The company’s holiday year runs from the first day of January to the last day of </w:t>
+      </w:r>
+    </w:p>
+    <w:p>
+      <w:pPr>
+        <w:pStyle w:val="Heading1"/>
+        <w:ind w:left="709" w:right="700"/>
+        <w:jc w:val="both"/>
+        <w:rPr>
+          <w:b w:val="0"/>
+          <w:bCs w:val="0"/>
+        </w:rPr>
+      </w:pPr>
+    </w:p>
+    <w:p>
+      <w:pPr>
+        <w:pStyle w:val="Heading1"/>
+        <w:ind w:left="709" w:right="700"/>
+        <w:jc w:val="both"/>
+        <w:rPr>
+          <w:b w:val="0"/>
+          <w:bCs w:val="0"/>
+        </w:rPr>
+      </w:pPr>
+      <w:r>
+        <w:rPr>
+          <w:b w:val="0"/>
+          <w:bCs w:val="0"/>
+        </w:rPr>
+        <w:t xml:space="preserve">December. The holidays are determined by the Company based on the office location of the Company </w:t>
+      </w:r>
+      <w:r>
+        <w:rPr>
+          <w:b w:val="0"/>
+          <w:bCs w:val="0"/>
+        </w:rPr>
+        <w:lastRenderedPageBreak/>
+        <w:t>to which you are assigned or based.</w:t>
       </w:r>
     </w:p>
     <w:p>
@@ -2811,6 +2779,27 @@
           <w:u w:val="single"/>
         </w:rPr>
       </w:pPr>
+      <w:r>
+        <w:rPr>
+          <w:b/>
+          <w:bCs/>
+          <w:u w:val="single"/>
+        </w:rPr>
+        <w:t>Representation and Warranty</w:t>
+      </w:r>
+    </w:p>
+    <w:p>
+      <w:pPr>
+        <w:pStyle w:val="BodyText"/>
+        <w:spacing w:before="6"/>
+        <w:ind w:firstLine="709"/>
+        <w:jc w:val="both"/>
+        <w:rPr>
+          <w:b/>
+          <w:bCs/>
+          <w:u w:val="single"/>
+        </w:rPr>
+      </w:pPr>
     </w:p>
     <w:p>
       <w:pPr>
@@ -2818,46 +2807,44 @@
         <w:spacing w:before="6"/>
         <w:ind w:left="709" w:right="702"/>
         <w:jc w:val="both"/>
-        <w:rPr>
-          <w:b/>
-          <w:bCs/>
-          <w:u w:val="single"/>
-        </w:rPr>
-      </w:pPr>
+      </w:pPr>
+      <w:r>
+        <w:t>Y</w:t>
+      </w:r>
+      <w:r>
+        <w:t>ou</w:t>
+      </w:r>
+      <w:r>
+        <w:t xml:space="preserve"> represent and warrant to the </w:t>
+      </w:r>
+      <w:r>
+        <w:t>Company</w:t>
+      </w:r>
+      <w:r>
+        <w:t xml:space="preserve"> that you are under no contractual or other restrictions or obligations which are inconsistent with the execution of this Agreement or which will interfere with the performance of </w:t>
+      </w:r>
+      <w:r>
+        <w:t>your s</w:t>
+      </w:r>
+      <w:r>
+        <w:t>ervices</w:t>
+      </w:r>
+      <w:r>
+        <w:t xml:space="preserve"> to the Company or it’s clients.</w:t>
+      </w:r>
+      <w:r>
+        <w:t xml:space="preserve"> You represent and warrant that you will not execute any instrument or grant or transfer any rights, titles and interests inconsistent with the terms and conditions of this Agreement. You further represent that such obligations and contractual arrangements that have a bearing on your employment with the Company have been disclosed to the Company.</w:t>
+      </w:r>
     </w:p>
     <w:p>
       <w:pPr>
         <w:pStyle w:val="BodyText"/>
         <w:spacing w:before="6"/>
-        <w:ind w:left="709" w:right="702"/>
-        <w:jc w:val="both"/>
-        <w:rPr>
-          <w:b/>
-          <w:bCs/>
-          <w:u w:val="single"/>
-        </w:rPr>
-      </w:pPr>
-    </w:p>
-    <w:p>
-      <w:pPr>
-        <w:pStyle w:val="BodyText"/>
-        <w:spacing w:before="6"/>
-        <w:ind w:left="709" w:right="702"/>
-        <w:jc w:val="both"/>
-        <w:rPr>
-          <w:b/>
-          <w:bCs/>
-          <w:u w:val="single"/>
-        </w:rPr>
-      </w:pPr>
-      <w:r>
-        <w:rPr>
-          <w:b/>
-          <w:bCs/>
-          <w:u w:val="single"/>
-        </w:rPr>
-        <w:t>Representation and Warranty</w:t>
-      </w:r>
+        <w:jc w:val="both"/>
+        <w:rPr>
+          <w:highlight w:val="yellow"/>
+        </w:rPr>
+      </w:pPr>
     </w:p>
     <w:p>
       <w:pPr>
@@ -2871,55 +2858,22 @@
           <w:u w:val="single"/>
         </w:rPr>
       </w:pPr>
-    </w:p>
-    <w:p>
-      <w:pPr>
-        <w:pStyle w:val="BodyText"/>
-        <w:spacing w:before="6"/>
-        <w:ind w:left="709" w:right="702"/>
-        <w:jc w:val="both"/>
-      </w:pPr>
-      <w:r>
-        <w:t>Y</w:t>
-      </w:r>
-      <w:r>
-        <w:t>ou</w:t>
-      </w:r>
-      <w:r>
-        <w:t xml:space="preserve"> represent and warrant to the </w:t>
-      </w:r>
-      <w:r>
-        <w:t>Company</w:t>
-      </w:r>
-      <w:r>
-        <w:t xml:space="preserve"> that you are under no contractual or other restrictions or obligations which are inconsistent with the execution of this Agreement or which will interfere with the performance of </w:t>
-      </w:r>
-      <w:r>
-        <w:t>your s</w:t>
-      </w:r>
-      <w:r>
-        <w:t>ervices</w:t>
-      </w:r>
-      <w:r>
-        <w:t xml:space="preserve"> to the Company or it’s clients.</w:t>
-      </w:r>
-      <w:r>
-        <w:t xml:space="preserve"> You represent and warrant that you </w:t>
-      </w:r>
-      <w:r>
-        <w:lastRenderedPageBreak/>
-        <w:t>will not execute any instrument or grant or transfer any rights, titles and interests inconsistent with the terms and conditions of this Agreement. You further represent that such obligations and contractual arrangements that have a bearing on your employment with the Company have been disclosed to the Company.</w:t>
-      </w:r>
-    </w:p>
-    <w:p>
-      <w:pPr>
-        <w:pStyle w:val="BodyText"/>
-        <w:spacing w:before="6"/>
-        <w:jc w:val="both"/>
-        <w:rPr>
-          <w:highlight w:val="yellow"/>
-        </w:rPr>
-      </w:pPr>
+      <w:r>
+        <w:rPr>
+          <w:b/>
+          <w:bCs/>
+          <w:u w:val="single"/>
+        </w:rPr>
+        <w:t xml:space="preserve">Notice and </w:t>
+      </w:r>
+      <w:r>
+        <w:rPr>
+          <w:b/>
+          <w:bCs/>
+          <w:u w:val="single"/>
+        </w:rPr>
+        <w:t>Address</w:t>
+      </w:r>
     </w:p>
     <w:p>
       <w:pPr>
@@ -2927,27 +2881,17 @@
         <w:spacing w:before="6"/>
         <w:ind w:firstLine="709"/>
         <w:jc w:val="both"/>
-        <w:rPr>
-          <w:b/>
-          <w:bCs/>
-          <w:u w:val="single"/>
-        </w:rPr>
-      </w:pPr>
-      <w:r>
-        <w:rPr>
-          <w:b/>
-          <w:bCs/>
-          <w:u w:val="single"/>
-        </w:rPr>
-        <w:t xml:space="preserve">Notice and </w:t>
-      </w:r>
-      <w:r>
-        <w:rPr>
-          <w:b/>
-          <w:bCs/>
-          <w:u w:val="single"/>
-        </w:rPr>
-        <w:t>Address</w:t>
+      </w:pPr>
+    </w:p>
+    <w:p>
+      <w:pPr>
+        <w:pStyle w:val="BodyText"/>
+        <w:spacing w:before="6"/>
+        <w:ind w:left="709"/>
+        <w:jc w:val="both"/>
+      </w:pPr>
+      <w:r>
+        <w:t>All notices, requests and other communications hereunder or under the non-disclosure and intellectual property assignment agreement mentioned above, must be in writing and will be deemed to have been duly given only if delivered personally or mailed (first class postage prepaid) or by electronic mail to the Parties at the following addresses: </w:t>
       </w:r>
     </w:p>
     <w:p>
@@ -2957,17 +2901,6 @@
         <w:ind w:firstLine="709"/>
         <w:jc w:val="both"/>
       </w:pPr>
-    </w:p>
-    <w:p>
-      <w:pPr>
-        <w:pStyle w:val="BodyText"/>
-        <w:spacing w:before="6"/>
-        <w:ind w:left="709"/>
-        <w:jc w:val="both"/>
-      </w:pPr>
-      <w:r>
-        <w:t>All notices, requests and other communications hereunder or under the non-disclosure and intellectual property assignment agreement mentioned above, must be in writing and will be deemed to have been duly given only if delivered personally or mailed (first class postage prepaid) or by electronic mail to the Parties at the following addresses: </w:t>
-      </w:r>
     </w:p>
     <w:p>
       <w:pPr>
@@ -3225,11 +3158,7 @@
         <w:t xml:space="preserve">to the extent </w:t>
       </w:r>
       <w:r>
-        <w:t xml:space="preserve">permitted by law. However, if it cannot be enforced at all, it will be considered severed (removed) </w:t>
-      </w:r>
-      <w:r>
-        <w:lastRenderedPageBreak/>
-        <w:t xml:space="preserve">from this Appointment Letter and Employment Agreement, and the remaining provisions </w:t>
+        <w:t xml:space="preserve">permitted by law. However, if it cannot be enforced at all, it will be considered severed (removed) from this Appointment Letter and Employment Agreement, and the remaining provisions </w:t>
       </w:r>
       <w:r>
         <w:t xml:space="preserve">  </w:t>
@@ -3279,68 +3208,92 @@
         <w:spacing w:before="90"/>
         <w:ind w:left="709" w:right="702"/>
         <w:jc w:val="both"/>
-      </w:pPr>
-      <w:r>
-        <w:t xml:space="preserve">Please sign </w:t>
-      </w:r>
-      <w:r>
-        <w:t>the copy of this Appointment Letter and Employment Agreement within</w:t>
-      </w:r>
-      <w:r>
-        <w:t xml:space="preserve"> the same day of </w:t>
-      </w:r>
-      <w:r>
-        <w:t xml:space="preserve">your receipt of this document. </w:t>
-      </w:r>
-      <w:r>
-        <w:t xml:space="preserve">We look forward to having you in the </w:t>
-      </w:r>
-      <w:r>
-        <w:rPr>
-          <w:b/>
-          <w:bCs/>
-        </w:rPr>
-        <w:t>InTimeTec</w:t>
-      </w:r>
-      <w:r>
-        <w:rPr>
-          <w:b/>
-          <w:bCs/>
-          <w:spacing w:val="1"/>
-        </w:rPr>
-        <w:t xml:space="preserve"> </w:t>
-      </w:r>
-      <w:r>
-        <w:rPr>
-          <w:b/>
-          <w:bCs/>
-        </w:rPr>
-        <w:t>Vision</w:t>
-      </w:r>
-      <w:r>
-        <w:rPr>
-          <w:b/>
-          <w:bCs/>
-        </w:rPr>
-        <w:t>S</w:t>
-      </w:r>
-      <w:r>
-        <w:rPr>
-          <w:b/>
-          <w:bCs/>
-        </w:rPr>
-        <w:t xml:space="preserve">oft </w:t>
-      </w:r>
-      <w:r>
-        <w:t>family.</w:t>
-      </w:r>
-      <w:r>
         <w:rPr>
           <w:sz w:val="22"/>
           <w:szCs w:val="22"/>
         </w:rPr>
-        <w:t xml:space="preserve"> </w:t>
-      </w:r>
+      </w:pPr>
+      <w:r>
+        <w:t xml:space="preserve">Please sign </w:t>
+      </w:r>
+      <w:r>
+        <w:t>the copy of this Appointment Letter and Employment Agreement within</w:t>
+      </w:r>
+      <w:r>
+        <w:t xml:space="preserve"> the same day of </w:t>
+      </w:r>
+      <w:r>
+        <w:t xml:space="preserve">your receipt of this document. </w:t>
+      </w:r>
+      <w:r>
+        <w:t xml:space="preserve">We look forward to having you in the </w:t>
+      </w:r>
+      <w:r>
+        <w:rPr>
+          <w:b/>
+          <w:bCs/>
+        </w:rPr>
+        <w:t>InTimeTec</w:t>
+      </w:r>
+      <w:r>
+        <w:rPr>
+          <w:b/>
+          <w:bCs/>
+          <w:spacing w:val="1"/>
+        </w:rPr>
+        <w:t xml:space="preserve"> </w:t>
+      </w:r>
+      <w:r>
+        <w:rPr>
+          <w:b/>
+          <w:bCs/>
+        </w:rPr>
+        <w:t>Vision</w:t>
+      </w:r>
+      <w:r>
+        <w:rPr>
+          <w:b/>
+          <w:bCs/>
+        </w:rPr>
+        <w:t>S</w:t>
+      </w:r>
+      <w:r>
+        <w:rPr>
+          <w:b/>
+          <w:bCs/>
+        </w:rPr>
+        <w:t xml:space="preserve">oft </w:t>
+      </w:r>
+      <w:r>
+        <w:t>family.</w:t>
+      </w:r>
+      <w:r>
+        <w:rPr>
+          <w:sz w:val="22"/>
+          <w:szCs w:val="22"/>
+        </w:rPr>
+        <w:t xml:space="preserve"> </w:t>
+      </w:r>
+    </w:p>
+    <w:p>
+      <w:pPr>
+        <w:pStyle w:val="BodyText"/>
+        <w:spacing w:before="90"/>
+        <w:ind w:left="709" w:right="702"/>
+        <w:jc w:val="both"/>
+        <w:rPr>
+          <w:sz w:val="22"/>
+          <w:szCs w:val="22"/>
+        </w:rPr>
+      </w:pPr>
+    </w:p>
+    <w:p>
+      <w:pPr>
+        <w:pStyle w:val="BodyText"/>
+        <w:spacing w:before="90"/>
+        <w:ind w:left="709" w:right="702"/>
+        <w:jc w:val="both"/>
+      </w:pPr>
       <w:r>
         <w:t xml:space="preserve">By accepting this, </w:t>
       </w:r>
@@ -3348,13 +3301,23 @@
         <w:t>y</w:t>
       </w:r>
       <w:r>
-        <w:t xml:space="preserve">ou confirm that all information provided by you to us is accurate and complete to the best of your </w:t>
+        <w:t xml:space="preserve">ou confirm that all information provided by you to us is accurate and complete to </w:t>
+      </w:r>
+      <w:r>
+        <w:lastRenderedPageBreak/>
+        <w:t xml:space="preserve">the best of your </w:t>
       </w:r>
       <w:r>
         <w:t>knowledge and</w:t>
       </w:r>
       <w:r>
-        <w:t xml:space="preserve"> that you have not misrepresented or willfully concealed any material information regarding your </w:t>
+        <w:t xml:space="preserve"> that you have not misrepresented or willfully concealed any material</w:t>
+      </w:r>
+      <w:r>
+        <w:t xml:space="preserve"> </w:t>
+      </w:r>
+      <w:r>
+        <w:t xml:space="preserve">information regarding your </w:t>
       </w:r>
       <w:r>
         <w:t>professional</w:t>
@@ -3666,6 +3629,104 @@
       <w:pPr>
         <w:spacing w:before="90"/>
         <w:jc w:val="center"/>
+        <w:rPr>
+          <w:b/>
+          <w:bCs/>
+          <w:u w:val="thick"/>
+        </w:rPr>
+      </w:pPr>
+    </w:p>
+    <w:p>
+      <w:pPr>
+        <w:spacing w:before="90"/>
+        <w:jc w:val="center"/>
+        <w:rPr>
+          <w:b/>
+          <w:bCs/>
+          <w:u w:val="thick"/>
+        </w:rPr>
+      </w:pPr>
+    </w:p>
+    <w:p>
+      <w:pPr>
+        <w:spacing w:before="90"/>
+        <w:jc w:val="center"/>
+        <w:rPr>
+          <w:b/>
+          <w:bCs/>
+          <w:u w:val="thick"/>
+        </w:rPr>
+      </w:pPr>
+    </w:p>
+    <w:p>
+      <w:pPr>
+        <w:spacing w:before="90"/>
+        <w:jc w:val="center"/>
+        <w:rPr>
+          <w:b/>
+          <w:bCs/>
+          <w:u w:val="thick"/>
+        </w:rPr>
+      </w:pPr>
+    </w:p>
+    <w:p>
+      <w:pPr>
+        <w:spacing w:before="90"/>
+        <w:jc w:val="center"/>
+        <w:rPr>
+          <w:b/>
+          <w:bCs/>
+          <w:u w:val="thick"/>
+        </w:rPr>
+      </w:pPr>
+    </w:p>
+    <w:p>
+      <w:pPr>
+        <w:spacing w:before="90"/>
+        <w:jc w:val="center"/>
+        <w:rPr>
+          <w:b/>
+          <w:bCs/>
+          <w:u w:val="thick"/>
+        </w:rPr>
+      </w:pPr>
+    </w:p>
+    <w:p>
+      <w:pPr>
+        <w:spacing w:before="90"/>
+        <w:jc w:val="center"/>
+        <w:rPr>
+          <w:b/>
+          <w:bCs/>
+          <w:u w:val="thick"/>
+        </w:rPr>
+      </w:pPr>
+    </w:p>
+    <w:p>
+      <w:pPr>
+        <w:spacing w:before="90"/>
+        <w:jc w:val="center"/>
+        <w:rPr>
+          <w:b/>
+          <w:bCs/>
+          <w:u w:val="thick"/>
+        </w:rPr>
+      </w:pPr>
+    </w:p>
+    <w:p>
+      <w:pPr>
+        <w:spacing w:before="90"/>
+        <w:jc w:val="center"/>
+        <w:rPr>
+          <w:b/>
+          <w:bCs/>
+          <w:u w:val="thick"/>
+        </w:rPr>
+      </w:pPr>
+    </w:p>
+    <w:p>
+      <w:pPr>
+        <w:spacing w:before="90"/>
         <w:rPr>
           <w:b/>
           <w:bCs/>
@@ -5087,51 +5148,7 @@
       <w:pPr>
         <w:pStyle w:val="Heading1"/>
         <w:spacing w:before="8"/>
-        <w:rPr>
-          <w:sz w:val="22"/>
-          <w:szCs w:val="22"/>
-          <w:u w:val="thick"/>
-        </w:rPr>
-      </w:pPr>
-    </w:p>
-    <w:p>
-      <w:pPr>
-        <w:pStyle w:val="Heading1"/>
-        <w:spacing w:before="8"/>
-        <w:rPr>
-          <w:sz w:val="22"/>
-          <w:szCs w:val="22"/>
-          <w:u w:val="thick"/>
-        </w:rPr>
-      </w:pPr>
-    </w:p>
-    <w:p>
-      <w:pPr>
-        <w:pStyle w:val="Heading1"/>
-        <w:spacing w:before="8"/>
-        <w:rPr>
-          <w:sz w:val="22"/>
-          <w:szCs w:val="22"/>
-          <w:u w:val="thick"/>
-        </w:rPr>
-      </w:pPr>
-    </w:p>
-    <w:p>
-      <w:pPr>
-        <w:pStyle w:val="Heading1"/>
-        <w:spacing w:before="8"/>
-        <w:rPr>
-          <w:sz w:val="22"/>
-          <w:szCs w:val="22"/>
-          <w:u w:val="thick"/>
-        </w:rPr>
-      </w:pPr>
-    </w:p>
-    <w:p>
-      <w:pPr>
-        <w:pStyle w:val="Heading1"/>
-        <w:spacing w:before="8"/>
-        <w:ind w:firstLine="720"/>
+        <w:ind w:left="0"/>
         <w:rPr>
           <w:sz w:val="22"/>
           <w:szCs w:val="22"/>
@@ -7360,30 +7377,15 @@
 </file>
 
 <file path=customXml/item1.xml><?xml version="1.0" encoding="utf-8"?>
-<b:Sources xmlns:b="http://schemas.openxmlformats.org/officeDocument/2006/bibliography" xmlns="http://schemas.openxmlformats.org/officeDocument/2006/bibliography" SelectedStyle="\APASixthEditionOfficeOnline.xsl" StyleName="APA" Version="6"/>
+<?mso-contentType ?>
+<FormTemplates xmlns="http://schemas.microsoft.com/sharepoint/v3/contenttype/forms">
+  <Display>DocumentLibraryForm</Display>
+  <Edit>DocumentLibraryForm</Edit>
+  <New>DocumentLibraryForm</New>
+</FormTemplates>
 </file>
 
 <file path=customXml/item2.xml><?xml version="1.0" encoding="utf-8"?>
-<p:properties xmlns:p="http://schemas.microsoft.com/office/2006/metadata/properties" xmlns:xsi="http://www.w3.org/2001/XMLSchema-instance" xmlns:pc="http://schemas.microsoft.com/office/infopath/2007/PartnerControls">
-  <documentManagement>
-    <TaxCatchAll xmlns="7599b5d6-ae20-4aec-a97e-17c9a39d495a" xsi:nil="true"/>
-    <lcf76f155ced4ddcb4097134ff3c332f xmlns="5fde2682-b346-4622-b077-6a51fae8b6aa">
-      <Terms xmlns="http://schemas.microsoft.com/office/infopath/2007/PartnerControls"/>
-    </lcf76f155ced4ddcb4097134ff3c332f>
-    <SharedWithUsers xmlns="7599b5d6-ae20-4aec-a97e-17c9a39d495a">
-      <UserInfo>
-        <DisplayName/>
-        <AccountId xsi:nil="true"/>
-        <AccountType/>
-      </UserInfo>
-    </SharedWithUsers>
-    <_ip_UnifiedCompliancePolicyUIAction xmlns="http://schemas.microsoft.com/sharepoint/v3" xsi:nil="true"/>
-    <_ip_UnifiedCompliancePolicyProperties xmlns="http://schemas.microsoft.com/sharepoint/v3" xsi:nil="true"/>
-  </documentManagement>
-</p:properties>
-</file>
-
-<file path=customXml/item3.xml><?xml version="1.0" encoding="utf-8"?>
 <ct:contentTypeSchema xmlns:ct="http://schemas.microsoft.com/office/2006/metadata/contentType" xmlns:ma="http://schemas.microsoft.com/office/2006/metadata/properties/metaAttributes" ct:_="" ma:_="" ma:contentTypeName="Document" ma:contentTypeID="0x010100EFB70A439C4E1146B4BEACF826B484FB" ma:contentTypeVersion="20" ma:contentTypeDescription="Create a new document." ma:contentTypeScope="" ma:versionID="df813c0a3bdf2966b390f294fc314f81">
   <xsd:schema xmlns:xsd="http://www.w3.org/2001/XMLSchema" xmlns:xs="http://www.w3.org/2001/XMLSchema" xmlns:p="http://schemas.microsoft.com/office/2006/metadata/properties" xmlns:ns1="http://schemas.microsoft.com/sharepoint/v3" xmlns:ns2="5fde2682-b346-4622-b077-6a51fae8b6aa" xmlns:ns3="7599b5d6-ae20-4aec-a97e-17c9a39d495a" targetNamespace="http://schemas.microsoft.com/office/2006/metadata/properties" ma:root="true" ma:fieldsID="b1c6a563b7f488635e9d48b3e4bb41e0" ns1:_="" ns2:_="" ns3:_="">
     <xsd:import namespace="http://schemas.microsoft.com/sharepoint/v3"/>
@@ -7655,36 +7657,39 @@
 </ct:contentTypeSchema>
 </file>
 
+<file path=customXml/item3.xml><?xml version="1.0" encoding="utf-8"?>
+<p:properties xmlns:p="http://schemas.microsoft.com/office/2006/metadata/properties" xmlns:xsi="http://www.w3.org/2001/XMLSchema-instance" xmlns:pc="http://schemas.microsoft.com/office/infopath/2007/PartnerControls">
+  <documentManagement>
+    <TaxCatchAll xmlns="7599b5d6-ae20-4aec-a97e-17c9a39d495a" xsi:nil="true"/>
+    <lcf76f155ced4ddcb4097134ff3c332f xmlns="5fde2682-b346-4622-b077-6a51fae8b6aa">
+      <Terms xmlns="http://schemas.microsoft.com/office/infopath/2007/PartnerControls"/>
+    </lcf76f155ced4ddcb4097134ff3c332f>
+    <SharedWithUsers xmlns="7599b5d6-ae20-4aec-a97e-17c9a39d495a">
+      <UserInfo>
+        <DisplayName/>
+        <AccountId xsi:nil="true"/>
+        <AccountType/>
+      </UserInfo>
+    </SharedWithUsers>
+    <_ip_UnifiedCompliancePolicyUIAction xmlns="http://schemas.microsoft.com/sharepoint/v3" xsi:nil="true"/>
+    <_ip_UnifiedCompliancePolicyProperties xmlns="http://schemas.microsoft.com/sharepoint/v3" xsi:nil="true"/>
+  </documentManagement>
+</p:properties>
+</file>
+
 <file path=customXml/item4.xml><?xml version="1.0" encoding="utf-8"?>
-<?mso-contentType ?>
-<FormTemplates xmlns="http://schemas.microsoft.com/sharepoint/v3/contenttype/forms">
-  <Display>DocumentLibraryForm</Display>
-  <Edit>DocumentLibraryForm</Edit>
-  <New>DocumentLibraryForm</New>
-</FormTemplates>
+<b:Sources xmlns:b="http://schemas.openxmlformats.org/officeDocument/2006/bibliography" xmlns="http://schemas.openxmlformats.org/officeDocument/2006/bibliography" SelectedStyle="\APASixthEditionOfficeOnline.xsl" StyleName="APA" Version="6"/>
 </file>
 
 <file path=customXml/itemProps1.xml><?xml version="1.0" encoding="utf-8"?>
-<ds:datastoreItem xmlns:ds="http://schemas.openxmlformats.org/officeDocument/2006/customXml" ds:itemID="{F3B38CCB-5D9B-41AE-B90F-85C145975EB7}">
+<ds:datastoreItem xmlns:ds="http://schemas.openxmlformats.org/officeDocument/2006/customXml" ds:itemID="{3CA397C3-9387-41D0-BDDA-DD10E687A044}">
   <ds:schemaRefs>
-    <ds:schemaRef ds:uri="http://schemas.openxmlformats.org/officeDocument/2006/bibliography"/>
+    <ds:schemaRef ds:uri="http://schemas.microsoft.com/sharepoint/v3/contenttype/forms"/>
   </ds:schemaRefs>
 </ds:datastoreItem>
 </file>
 
 <file path=customXml/itemProps2.xml><?xml version="1.0" encoding="utf-8"?>
-<ds:datastoreItem xmlns:ds="http://schemas.openxmlformats.org/officeDocument/2006/customXml" ds:itemID="{611CF45A-1675-4B5D-AB3F-549FD18162B0}">
-  <ds:schemaRefs>
-    <ds:schemaRef ds:uri="http://schemas.microsoft.com/office/2006/metadata/properties"/>
-    <ds:schemaRef ds:uri="http://schemas.microsoft.com/office/infopath/2007/PartnerControls"/>
-    <ds:schemaRef ds:uri="7599b5d6-ae20-4aec-a97e-17c9a39d495a"/>
-    <ds:schemaRef ds:uri="5fde2682-b346-4622-b077-6a51fae8b6aa"/>
-    <ds:schemaRef ds:uri="http://schemas.microsoft.com/sharepoint/v3"/>
-  </ds:schemaRefs>
-</ds:datastoreItem>
-</file>
-
-<file path=customXml/itemProps3.xml><?xml version="1.0" encoding="utf-8"?>
 <ds:datastoreItem xmlns:ds="http://schemas.openxmlformats.org/officeDocument/2006/customXml" ds:itemID="{F6806259-963C-48A9-A622-DA5E443F5CEC}">
   <ds:schemaRefs>
     <ds:schemaRef ds:uri="http://schemas.microsoft.com/office/2006/metadata/contentType"/>
@@ -7704,10 +7709,22 @@
 </ds:datastoreItem>
 </file>
 
+<file path=customXml/itemProps3.xml><?xml version="1.0" encoding="utf-8"?>
+<ds:datastoreItem xmlns:ds="http://schemas.openxmlformats.org/officeDocument/2006/customXml" ds:itemID="{611CF45A-1675-4B5D-AB3F-549FD18162B0}">
+  <ds:schemaRefs>
+    <ds:schemaRef ds:uri="http://schemas.microsoft.com/office/2006/metadata/properties"/>
+    <ds:schemaRef ds:uri="http://schemas.microsoft.com/office/infopath/2007/PartnerControls"/>
+    <ds:schemaRef ds:uri="7599b5d6-ae20-4aec-a97e-17c9a39d495a"/>
+    <ds:schemaRef ds:uri="5fde2682-b346-4622-b077-6a51fae8b6aa"/>
+    <ds:schemaRef ds:uri="http://schemas.microsoft.com/sharepoint/v3"/>
+  </ds:schemaRefs>
+</ds:datastoreItem>
+</file>
+
 <file path=customXml/itemProps4.xml><?xml version="1.0" encoding="utf-8"?>
-<ds:datastoreItem xmlns:ds="http://schemas.openxmlformats.org/officeDocument/2006/customXml" ds:itemID="{3CA397C3-9387-41D0-BDDA-DD10E687A044}">
+<ds:datastoreItem xmlns:ds="http://schemas.openxmlformats.org/officeDocument/2006/customXml" ds:itemID="{F3B38CCB-5D9B-41AE-B90F-85C145975EB7}">
   <ds:schemaRefs>
-    <ds:schemaRef ds:uri="http://schemas.microsoft.com/sharepoint/v3/contenttype/forms"/>
+    <ds:schemaRef ds:uri="http://schemas.openxmlformats.org/officeDocument/2006/bibliography"/>
   </ds:schemaRefs>
 </ds:datastoreItem>
 </file>
</xml_diff>